<commit_message>
Finalize initial game balance specifications
</commit_message>
<xml_diff>
--- a/docs/01_Meong-Meong_企画書.docx
+++ b/docs/01_Meong-Meong_企画書.docx
@@ -422,7 +422,7 @@
     </w:p>
     <w:p>
       <w:r>
-        <w:t>その後、3種類のミニゲームでそれぞれ一定スコア以上を獲得することで、新しい遊びが解放される。</w:t>
+        <w:t>その後、3種類のミニゲームでそれぞれ定めた最終結果の条件を満たすことで、新しい遊びが解放される。</w:t>
       </w:r>
     </w:p>
     <w:p>
@@ -507,17 +507,17 @@
     </w:p>
     <w:p>
       <w:r>
-        <w:t>それぞれのミニゲームにはスコアを設定し、ゲームごとに定めた一定スコア以上を獲得することで、対応する新しい遊びを解放する。</w:t>
-      </w:r>
-    </w:p>
-    <w:p>
-      <w:r>
-        <w:t>解放に必要な具体的なスコアは、各ミニゲームのルールや難易度を決定した後に個別に設定する。</w:t>
-      </w:r>
-    </w:p>
-    <w:p>
-      <w:r>
-        <w:t>ハイスコアの保存および表示は行わず、スコアは主に遊びの解放条件として使用する。</w:t>
+        <w:t>各ミニゲームでは距離またはスコアを記録し、ゲームごとに定めた最終結果の条件を満たすことで、対応する新しい遊びを解放する。</w:t>
+      </w:r>
+    </w:p>
+    <w:p>
+      <w:r>
+        <w:t>解放条件は、お散歩ジャンプ500m以上、吠えるタイピング10点以上、おやつキャッチ15点以上とする。条件や進捗は事前に表示しない。</w:t>
+      </w:r>
+    </w:p>
+    <w:p>
+      <w:r>
+        <w:t>各ミニゲームの自己ベストはユーザーごとにSQLiteへ保存し、スコアや距離は結果表示、自己ベスト更新、遊びの解放判定に使用する。</w:t>
       </w:r>
     </w:p>
     <w:p>
@@ -537,7 +537,7 @@
     </w:p>
     <w:p>
       <w:r>
-        <w:t>ゲーム開始時には「なでる」のみ利用できるが、各ミニゲームで一定スコア以上を獲得することで、「ノーズワーク」「ひっぱりっこ」「ボール遊び」がそれぞれ解放される。</w:t>
+        <w:t>ゲーム開始時には「なでる」のみ利用できるが、お散歩ジャンプ500m以上、吠えるタイピング10点以上、おやつキャッチ15点以上の各条件を満たすことで、対応する遊びが解放される。</w:t>
       </w:r>
     </w:p>
     <w:p>
@@ -609,12 +609,12 @@
     </w:p>
     <w:p>
       <w:r>
-        <w:t>一定距離まで進むことができた場合、「ノーズワーク」を新しい遊びとして解放する。</w:t>
-      </w:r>
-    </w:p>
-    <w:p>
-      <w:r>
-        <w:t>解放に必要な具体的な距離やスコアについては、実装後のプレイテストを通じてゲームの難易度を確認したうえで決定する。</w:t>
+        <w:t>ゲーム終了時に確定した最終到達距離が500m以上の場合、「ノーズワーク」を新しい遊びとして解放する。</w:t>
+      </w:r>
+    </w:p>
+    <w:p>
+      <w:r>
+        <w:t>距離は20px＝1mで換算し、ゲーム終了時に小数点以下を切り捨てた整数mを最終結果とする。この整数mを結果表示、自己ベスト、SQLite保存、500mの解放判定で共通して使用する。</w:t>
       </w:r>
     </w:p>
     <w:p>
@@ -634,7 +634,7 @@
     </w:p>
     <w:p>
       <w:r>
-        <w:t>制限時間内に正しい英単語を完成させることができれば、その単語への入力は成功となり、次の英単語へ進む。入力に成功した際には、犬が吠えるアニメーションや効果音などのリアクションを行う。</w:t>
+        <w:t>英単語が画面左端へ到達する前に正しく入力できれば、その単語への入力は成功となり、1点を加算して次の英単語へ進む。入力に成功した際には、犬が吠えるアニメーションや効果音などのリアクションを行う。</w:t>
       </w:r>
     </w:p>
     <w:p>
@@ -649,12 +649,12 @@
     </w:p>
     <w:p>
       <w:r>
-        <w:t>1プレイの時間は45秒とする。45秒間、時間切れによる失敗をせずにプレイを継続できればクリアとする。</w:t>
-      </w:r>
-    </w:p>
-    <w:p>
-      <w:r>
-        <w:t>クリアした場合、「ひっぱりっこ」を新しい遊びとして解放する。</w:t>
+        <w:t>ゲーム全体の制限時間は設けない。英単語を正しく入力し続けるエンドレス型とし、入力が完了する前に対象の英単語が画面左端へ到達した時点でゲーム終了とする。</w:t>
+      </w:r>
+    </w:p>
+    <w:p>
+      <w:r>
+        <w:t>ゲーム終了時の最終スコアが10点以上の場合、「ひっぱりっこ」を新しい遊びとして解放する。</w:t>
       </w:r>
     </w:p>
     <w:p>
@@ -700,17 +700,17 @@
     </w:p>
     <w:p>
       <w:r>
-        <w:t>制限時間は30秒とし、30秒以内に10ポイントへ到達できればクリアとする。制限時間終了時までに10ポイントへ到達できなかった場合は失敗とする。</w:t>
-      </w:r>
-    </w:p>
-    <w:p>
-      <w:r>
-        <w:t>10ポイントに到達した場合、その時点でゲームを終了してクリアとし、「ボール遊び」を新しい遊びとして解放する。</w:t>
-      </w:r>
-    </w:p>
-    <w:p>
-      <w:r>
-        <w:t>制限時間、必要ポイント数、アイテムの出現頻度などについては暫定値とし、実装後のプレイテストによって必要に応じて調整する。</w:t>
+        <w:t>制限時間は30秒とし、30秒終了時の最終スコアが10点以上であればクリアとする。途中で10点へ到達してもゲームを終了せず、30秒まで継続する。</w:t>
+      </w:r>
+    </w:p>
+    <w:p>
+      <w:r>
+        <w:t>30秒終了時の最終スコアが15点以上の場合、「ボール遊び」を新しい遊びとして解放する。途中で15点へ到達してもゲームを終了しない。</w:t>
+      </w:r>
+    </w:p>
+    <w:p>
+      <w:r>
+        <w:t>制限時間30秒、10点以上のクリア条件、15点以上の解放条件は初期版の固定仕様とする。アイテムの出現頻度など、今回確定していないゲームバランス値はプレイテストで調整する。</w:t>
       </w:r>
     </w:p>
     <w:p/>
@@ -741,30 +741,27 @@
     </w:p>
     <w:p>
       <w:r>
-        <w:t>・お散歩ジャンプゲームの条件達成</w:t>
-      </w:r>
-      <w:r>
+        <w:t>・お散歩ジャンプゲームの最終到達距離が500m以上</w:t>
         <w:br/>
         <w:t xml:space="preserve">　→ ノーズワークを解放</w:t>
       </w:r>
-    </w:p>
-    <w:p>
-      <w:r>
-        <w:t>・吠えるタイピングゲームを45秒間クリア</w:t>
-      </w:r>
-      <w:r>
+      <w:r/>
+    </w:p>
+    <w:p>
+      <w:r>
+        <w:t>・吠えるタイピングゲームの最終スコアが10点以上</w:t>
         <w:br/>
         <w:t xml:space="preserve">　→ ひっぱりっこを解放</w:t>
       </w:r>
-    </w:p>
-    <w:p>
-      <w:r>
-        <w:t>・おやつキャッチゲームで30秒以内に10ポイント獲得</w:t>
-      </w:r>
-      <w:r>
+      <w:r/>
+    </w:p>
+    <w:p>
+      <w:r>
+        <w:t>・おやつキャッチゲームの30秒終了時の最終スコアが15点以上</w:t>
         <w:br/>
         <w:t xml:space="preserve">　→ ボール遊びを解放</w:t>
       </w:r>
+      <w:r/>
     </w:p>
     <w:p>
       <w:r>
@@ -783,7 +780,7 @@
     </w:p>
     <w:p>
       <w:r>
-        <w:t>新しい遊びの解放条件を達成した場合には、アンロック専用の簡単な演出を表示する。</w:t>
+        <w:t>新しい遊びの解放条件を初めて達成した場合のみ、アンロック専用の簡単な演出を表示する。</w:t>
       </w:r>
     </w:p>
     <w:p>
@@ -807,7 +804,7 @@
     </w:p>
     <w:p>
       <w:r>
-        <w:t>7.3 アンロック状態とユーザーデータの保存</w:t>
+        <w:t>7.3 アンロック状態・自己ベストとユーザーデータの保存</w:t>
       </w:r>
     </w:p>
     <w:p>
@@ -817,39 +814,42 @@
     </w:p>
     <w:p>
       <w:r>
-        <w:t>ログインしたユーザーごとに個別のセーブデータを持たせ、少なくとも以下の情報を保存する。</w:t>
+        <w:t>ログインしたユーザーごとに個別のセーブデータを持たせ、少なくとも以下の情報をSQLiteへ保存する。</w:t>
       </w:r>
     </w:p>
     <w:p>
       <w:r>
         <w:t>・犬に設定したニックネーム</w:t>
-      </w:r>
-      <w:r>
+        <w:br/>
+        <w:t>・お散歩ジャンプの自己ベスト</w:t>
+        <w:br/>
+        <w:t>・吠えるタイピングの自己ベスト</w:t>
+        <w:br/>
+        <w:t>・おやつキャッチの自己ベスト</w:t>
         <w:br/>
         <w:t>・ノーズワークの解放状態</w:t>
-      </w:r>
-      <w:r>
         <w:br/>
         <w:t>・ひっぱりっこの解放状態</w:t>
-      </w:r>
-      <w:r>
         <w:br/>
         <w:t>・ボール遊びの解放状態</w:t>
       </w:r>
-    </w:p>
-    <w:p>
-      <w:r>
-        <w:t>一度解放した遊びは、そのユーザーの進行データとして保存し、ゲームを終了または再起動した場合でも再びロック状態には戻らない。</w:t>
-      </w:r>
-    </w:p>
-    <w:p>
-      <w:r>
-        <w:t>同じPCを使用する場合でも、異なるユーザーでログインした場合には、それぞれ別のニックネームおよびアンロック状態を読み込む。</w:t>
-      </w:r>
-    </w:p>
-    <w:p>
-      <w:r>
-        <w:t>具体的なデータ保存方法や使用技術については、開発仕様を決定する段階で定める。</w:t>
+      <w:r/>
+      <w:r/>
+      <w:r/>
+    </w:p>
+    <w:p>
+      <w:r>
+        <w:t>自己ベストと一度解放した遊びは、そのユーザーの進行データとして保存し、ゲームを終了または再起動した場合でも保持する。</w:t>
+      </w:r>
+    </w:p>
+    <w:p>
+      <w:r>
+        <w:t>同じPCを使用する場合でも、異なるユーザーでログインした場合には、それぞれ別のニックネーム、自己ベスト、アンロック状態を読み込む。</w:t>
+      </w:r>
+    </w:p>
+    <w:p>
+      <w:r>
+        <w:t>データ保存にはSQLiteを使用し、自己ベストおよび解放状態をユーザーごとに管理する。</w:t>
       </w:r>
     </w:p>
     <w:p>
@@ -869,7 +869,7 @@
     </w:p>
     <w:p>
       <w:r>
-        <w:t>3種類の遊びをすべて解放した後は、レベル上げやハイスコア更新などを要求せず、プレイヤー自身が好きなミニゲームや犬との遊びを自由に選んで楽しむことを基本とする。</w:t>
+        <w:t>3種類の遊びをすべて解放した後も自己ベストは保存するが、更新をプレイヤーへ要求せず、好きなミニゲームや犬との遊びを自由に選んで楽しむことを基本とする。</w:t>
       </w:r>
     </w:p>
     <w:p>
@@ -1291,40 +1291,33 @@
     <w:p>
       <w:r>
         <w:t>お散歩ジャンプゲーム</w:t>
-      </w:r>
-      <w:r>
         <w:br/>
         <w:t>・犬のキャラクター</w:t>
-      </w:r>
-      <w:r>
         <w:br/>
         <w:t>・障害物および足場</w:t>
-      </w:r>
-      <w:r>
-        <w:br/>
-        <w:t>・距離またはスコア</w:t>
-      </w:r>
+        <w:br/>
+        <w:t>・20px＝1mで換算した現在の距離</w:t>
+      </w:r>
+      <w:r/>
+      <w:r/>
+      <w:r/>
     </w:p>
     <w:p>
       <w:r>
         <w:t>吠えるタイピングゲーム</w:t>
-      </w:r>
-      <w:r>
         <w:br/>
         <w:t>・犬のキャラクター</w:t>
-      </w:r>
-      <w:r>
         <w:br/>
         <w:t>・入力対象となる英単語</w:t>
-      </w:r>
-      <w:r>
         <w:br/>
         <w:t>・プレイヤーの入力内容</w:t>
-      </w:r>
-      <w:r>
-        <w:br/>
-        <w:t>・残り時間</w:t>
-      </w:r>
+        <w:br/>
+        <w:t>・現在のスコア</w:t>
+      </w:r>
+      <w:r/>
+      <w:r/>
+      <w:r/>
+      <w:r/>
     </w:p>
     <w:p>
       <w:r>
@@ -1376,23 +1369,21 @@
     <w:p>
       <w:r>
         <w:t>・「クリア」または「ゲームオーバー」などの結果</w:t>
-      </w:r>
-      <w:r>
-        <w:br/>
-        <w:t>・そのプレイで獲得したスコア、距離、ポイントなど</w:t>
-      </w:r>
-      <w:r>
+        <w:br/>
+        <w:t>・そのプレイで確定したスコア、距離、ポイントなど</w:t>
+        <w:br/>
+        <w:t>・自己ベスト</w:t>
         <w:br/>
         <w:t>・「もう一度」ボタン</w:t>
-      </w:r>
-      <w:r>
         <w:br/>
         <w:t>・「ミニゲーム選択へ戻る」ボタン</w:t>
-      </w:r>
-      <w:r>
         <w:br/>
         <w:t>・「部屋へ戻る」ボタン</w:t>
       </w:r>
+      <w:r/>
+      <w:r/>
+      <w:r/>
+      <w:r/>
     </w:p>
     <w:p>
       <w:r>
@@ -1906,12 +1897,12 @@
     </w:p>
     <w:p>
       <w:r>
-        <w:t>ゲーム内のユーザー情報および進行状況の保存にはSQLiteを使用する。</w:t>
-      </w:r>
-    </w:p>
-    <w:p>
-      <w:r>
-        <w:t>データはローカルPC内に保存し、ログインユーザーごとに個別のゲームデータを管理する。</w:t>
+        <w:t>ゲーム内のユーザー情報、自己ベストおよび進行状況の保存にはSQLiteを使用する。</w:t>
+      </w:r>
+    </w:p>
+    <w:p>
+      <w:r>
+        <w:t>データはローカルPC内に保存し、ログインユーザーごとに個別のゲームデータを管理する。自己ベストと解放状態をユーザー間で共有しない。</w:t>
       </w:r>
     </w:p>
     <w:p>
@@ -1922,27 +1913,28 @@
     <w:p>
       <w:r>
         <w:t>・ユーザー名</w:t>
-      </w:r>
-      <w:r>
         <w:br/>
         <w:t>・パスワード情報</w:t>
-      </w:r>
-      <w:r>
         <w:br/>
         <w:t>・犬のニックネーム</w:t>
-      </w:r>
-      <w:r>
+        <w:br/>
+        <w:t>・お散歩ジャンプの自己ベスト</w:t>
+        <w:br/>
+        <w:t>・吠えるタイピングの自己ベスト</w:t>
+        <w:br/>
+        <w:t>・おやつキャッチの自己ベスト</w:t>
         <w:br/>
         <w:t>・ノーズワークの解放状態</w:t>
-      </w:r>
-      <w:r>
         <w:br/>
         <w:t>・ひっぱりっこの解放状態</w:t>
-      </w:r>
-      <w:r>
         <w:br/>
         <w:t>・ボール遊びの解放状態</w:t>
       </w:r>
+      <w:r/>
+      <w:r/>
+      <w:r/>
+      <w:r/>
+      <w:r/>
     </w:p>
     <w:p>
       <w:r>
@@ -1981,7 +1973,7 @@
     </w:p>
     <w:p>
       <w:r>
-        <w:t>ログイン後は、そのユーザーに紐づく犬のニックネームや遊びの解放状態などを読み込む。</w:t>
+        <w:t>ログイン後は、そのユーザーに紐づく犬のニックネーム、3種類のミニゲームの自己ベスト、遊びの解放状態などを読み込む。</w:t>
       </w:r>
     </w:p>
     <w:p>
@@ -2192,40 +2184,35 @@
     <w:p>
       <w:r>
         <w:t>ミニゲーム機能</w:t>
-      </w:r>
-      <w:r>
         <w:br/>
         <w:t>・お散歩ジャンプゲーム</w:t>
-      </w:r>
-      <w:r>
         <w:br/>
         <w:t>・吠えるタイピングゲーム</w:t>
-      </w:r>
-      <w:r>
         <w:br/>
         <w:t>・おやつキャッチゲーム</w:t>
-      </w:r>
-      <w:r>
-        <w:br/>
-        <w:t>・ミニゲーム結果表示</w:t>
-      </w:r>
+        <w:br/>
+        <w:t>・ミニゲーム結果および自己ベスト表示</w:t>
+      </w:r>
+      <w:r/>
+      <w:r/>
+      <w:r/>
+      <w:r/>
     </w:p>
     <w:p>
       <w:r>
         <w:t>進行機能</w:t>
-      </w:r>
-      <w:r>
         <w:br/>
         <w:t>・条件達成による新しい遊びのアンロック</w:t>
-      </w:r>
-      <w:r>
+        <w:br/>
+        <w:t>・自己ベストの保存</w:t>
         <w:br/>
         <w:t>・アンロック状態の保存</w:t>
-      </w:r>
-      <w:r>
         <w:br/>
         <w:t>・アンロック演出</w:t>
       </w:r>
+      <w:r/>
+      <w:r/>
+      <w:r/>
     </w:p>
     <w:p>
       <w:r>
@@ -2306,30 +2293,23 @@
     <w:p>
       <w:r>
         <w:t>ユーザー関連</w:t>
-      </w:r>
-      <w:r>
         <w:br/>
         <w:t>・ユーザー登録</w:t>
-      </w:r>
-      <w:r>
-        <w:br/>
-      </w:r>
-      <w:r>
-        <w:lastRenderedPageBreak/>
+        <w:br/>
         <w:t>・ログイン</w:t>
-      </w:r>
-      <w:r>
         <w:br/>
         <w:t>・ログアウト</w:t>
-      </w:r>
-      <w:r>
         <w:br/>
         <w:t>・初回ニックネーム設定</w:t>
-      </w:r>
-      <w:r>
-        <w:br/>
-        <w:t>・ユーザーごとのデータ保存</w:t>
-      </w:r>
+        <w:br/>
+        <w:t>・ユーザーごとの自己ベストおよび解放状態の保存</w:t>
+      </w:r>
+      <w:r/>
+      <w:r/>
+      <w:r/>
+      <w:r/>
+      <w:r/>
+      <w:r/>
     </w:p>
     <w:p>
       <w:r>
@@ -2389,19 +2369,18 @@
     <w:p>
       <w:r>
         <w:t>ゲーム進行</w:t>
-      </w:r>
-      <w:r>
         <w:br/>
         <w:t>・ミニゲームの条件達成による遊びのアンロック</w:t>
-      </w:r>
-      <w:r>
+        <w:br/>
+        <w:t>・自己ベストの保存</w:t>
         <w:br/>
         <w:t>・アンロック状態の保存</w:t>
-      </w:r>
-      <w:r>
-        <w:br/>
-        <w:t>・アンロック時のサプライズ演出</w:t>
-      </w:r>
+        <w:br/>
+        <w:t>・初回条件達成時のみ行うサプライズ演出</w:t>
+      </w:r>
+      <w:r/>
+      <w:r/>
+      <w:r/>
     </w:p>
     <w:p>
       <w:r>
@@ -2435,7 +2414,7 @@
     </w:p>
     <w:p>
       <w:r>
-        <w:t>特に、「3種類のミニゲームを遊ぶ」「条件を達成する」「新しい遊びが解放される」「解放状態がユーザーごとに保存される」という本作の中心的なゲーム体験を初期版の必須範囲とする。</w:t>
+        <w:t>特に、「3種類のミニゲームを遊ぶ」「条件を達成する」「新しい遊びが解放される」「自己ベストと解放状態がユーザーごとに保存される」という本作の中心的なゲーム体験を初期版の必須範囲とする。</w:t>
       </w:r>
     </w:p>
     <w:p>
@@ -2486,19 +2465,16 @@
     <w:p>
       <w:r>
         <w:t>スコア・競争要素</w:t>
-      </w:r>
-      <w:r>
-        <w:br/>
-        <w:t>・ハイスコア保存</w:t>
-      </w:r>
-      <w:r>
         <w:br/>
         <w:t>・オンラインランキング</w:t>
-      </w:r>
-      <w:r>
+        <w:br/>
+        <w:t>・全ユーザー共通ランキング</w:t>
         <w:br/>
         <w:t>・プレイヤー同士の競争要素</w:t>
       </w:r>
+      <w:r/>
+      <w:r/>
+      <w:r/>
     </w:p>
     <w:p>
       <w:r>
@@ -2638,7 +2614,7 @@
     </w:p>
     <w:p>
       <w:r>
-        <w:t>・初回ログイン時に犬のニックネームを設定でき、その内容がユーザーごとに保存される。</w:t>
+        <w:t>・初回ログイン時に犬のニックネームを設定でき、その内容がユーザーごとにSQLiteへ保存される。</w:t>
       </w:r>
     </w:p>
     <w:p>
@@ -2658,7 +2634,7 @@
     </w:p>
     <w:p>
       <w:r>
-        <w:t>・各ミニゲームで設定された条件を達成した場合、対応する新しい遊びが正しく解放される。</w:t>
+        <w:t>・お散歩ジャンプ500m以上、吠えるタイピング10点以上、おやつキャッチ15点以上の各条件を達成した場合、対応する新しい遊びが正しく解放される。</w:t>
       </w:r>
     </w:p>
     <w:p>
@@ -2673,7 +2649,7 @@
     </w:p>
     <w:p>
       <w:r>
-        <w:t>・ゲームを終了して再起動した場合でも、ユーザーごとの犬のニックネームおよび遊びの解放状態が保持される。</w:t>
+        <w:t>・ゲームを終了して再起動した場合でも、ユーザーごとの犬のニックネーム、3種類の自己ベストおよび遊びの解放状態がSQLiteに保持される。</w:t>
       </w:r>
     </w:p>
     <w:p>
@@ -3072,55 +3048,48 @@
     <w:p>
       <w:r>
         <w:t>・ユーザー登録からログインまで正常に動作するか</w:t>
-      </w:r>
-      <w:r>
         <w:br/>
         <w:t>・ニックネームが正しく保存されるか</w:t>
-      </w:r>
-      <w:r>
         <w:br/>
         <w:t>・ログアウトおよび再ログインが正常に動作するか</w:t>
-      </w:r>
-      <w:r>
         <w:br/>
         <w:t>・3種類のミニゲームを正常にプレイできるか</w:t>
-      </w:r>
-      <w:r>
-        <w:br/>
-        <w:t>・各ミニゲームの終了条件が正しく動作するか</w:t>
-      </w:r>
-      <w:r>
-        <w:br/>
-        <w:t>・条件達成時に対応する遊びが解放されるか</w:t>
-      </w:r>
-      <w:r>
+        <w:br/>
+        <w:t>・お散歩ジャンプが20px＝1mで換算され、整数mの最終到達距離500m以上でノーズワークが解放されるか</w:t>
+        <w:br/>
+        <w:t>・吠えるタイピングが1語＝1点のエンドレス型で、単語が左端へ到達すると終了し、最終スコア10点以上でひっぱりっこが解放されるか</w:t>
+        <w:br/>
+        <w:t>・おやつキャッチが30秒継続し、最終スコア10点以上でクリア、15点以上でボール遊びが解放されるか</w:t>
+        <w:br/>
+        <w:t>・解放条件や進捗が事前表示されないか</w:t>
         <w:br/>
         <w:t>・アンロック演出が初回のみ表示されるか</w:t>
-      </w:r>
-      <w:r>
-        <w:br/>
-        <w:t>・解放状態がユーザーごとに保存されるか</w:t>
-      </w:r>
-      <w:r>
+        <w:br/>
+        <w:t>・自己ベストと解放状態がユーザーごとにSQLiteへ保存されるか</w:t>
         <w:br/>
         <w:t>・ゲーム再起動後も保存内容が保持されるか</w:t>
-      </w:r>
-      <w:r>
         <w:br/>
         <w:t>・ごはんおよび4種類の遊びが正常に動作するか</w:t>
-      </w:r>
-      <w:r>
         <w:br/>
         <w:t>・BGM、効果音、アニメーションが正常に再生されるか</w:t>
-      </w:r>
-      <w:r>
         <w:br/>
         <w:t>・ゲーム進行を妨げる重大な不具合がないか</w:t>
       </w:r>
-    </w:p>
-    <w:p>
-      <w:r>
-        <w:t>また、実際にプレイした結果をもとに、各ミニゲームの速度、制限時間、必要ポイントなどを必要に応じて調整する。</w:t>
+      <w:r/>
+      <w:r/>
+      <w:r/>
+      <w:r/>
+      <w:r/>
+      <w:r/>
+      <w:r/>
+      <w:r/>
+      <w:r/>
+      <w:r/>
+      <w:r/>
+    </w:p>
+    <w:p>
+      <w:r>
+        <w:t>また、実際にプレイした結果をもとに、各ミニゲームの速度、出現間隔、物理パラメータなど、今回固定していないゲームバランス値を必要に応じて調整する。</w:t>
       </w:r>
     </w:p>
     <w:p>
@@ -3254,7 +3223,7 @@
     </w:p>
     <w:p>
       <w:r>
-        <w:t>「お散歩ジャンプゲーム」「吠えるタイピングゲーム」「おやつキャッチゲーム」の条件を達成すると、それぞれ「ノーズワーク」「ひっぱりっこ」「ボール遊び」という新しいコミュニケーションが解放される。</w:t>
+        <w:t>お散歩ジャンプで500m以上、吠えるタイピングで10点以上、おやつキャッチで15点以上の最終結果を達成すると、それぞれ「ノーズワーク」「ひっぱりっこ」「ボール遊び」という新しいコミュニケーションが解放される。</w:t>
       </w:r>
     </w:p>
     <w:p>

</xml_diff>